<commit_message>
Add main.py and update project documents
Add new main.py and update binary project documents (Documentation.docx, LAM_Jimmy-planning-initial-TPI.xlsx). Two Office temporary files (~$cumentation.docx, ~WRL0789.tmp) were also added — likely editor temp files; consider removing them and adding appropriate patterns to .gitignore if they were committed unintentionally.
</commit_message>
<xml_diff>
--- a/Documents/Documentation.docx
+++ b/Documents/Documentation.docx
@@ -127,7 +127,13 @@
     <w:sdt>
       <w:sdtPr>
         <w:rPr>
-          <w:lang w:val="fr-FR"/>
+          <w:rFonts w:ascii="Arial" w:eastAsiaTheme="minorHAnsi" w:hAnsi="Arial" w:cs="Arial"/>
+          <w:color w:val="auto"/>
+          <w:kern w:val="2"/>
+          <w:sz w:val="24"/>
+          <w:szCs w:val="24"/>
+          <w:lang w:val="fr-FR" w:eastAsia="en-US"/>
+          <w14:ligatures w14:val="standardContextual"/>
         </w:rPr>
         <w:id w:val="-558092176"/>
         <w:docPartObj>
@@ -135,17 +141,6 @@
           <w:docPartUnique/>
         </w:docPartObj>
       </w:sdtPr>
-      <w:sdtEndPr>
-        <w:rPr>
-          <w:rFonts w:ascii="Arial" w:eastAsiaTheme="minorHAnsi" w:hAnsi="Arial" w:cs="Arial"/>
-          <w:color w:val="auto"/>
-          <w:kern w:val="2"/>
-          <w:sz w:val="24"/>
-          <w:szCs w:val="24"/>
-          <w:lang w:eastAsia="en-US"/>
-          <w14:ligatures w14:val="standardContextual"/>
-        </w:rPr>
-      </w:sdtEndPr>
       <w:sdtContent>
         <w:p>
           <w:pPr>
@@ -3143,7 +3138,16 @@
         </w:numPr>
       </w:pPr>
       <w:r>
-        <w:t>Mettre en place un système de gestion des utilisateurs avec des rôles distincts</w:t>
+        <w:t xml:space="preserve">Mettre en place un système de gestion des utilisateurs avec des rôles </w:t>
+      </w:r>
+      <w:r>
+        <w:t>et une authenti</w:t>
+      </w:r>
+      <w:r>
+        <w:t>fic</w:t>
+      </w:r>
+      <w:r>
+        <w:t>ation</w:t>
       </w:r>
     </w:p>
     <w:p>
@@ -3172,10 +3176,24 @@
     </w:p>
     <w:p>
       <w:pPr>
+        <w:rPr>
+          <w:rFonts w:ascii="Arial Black" w:eastAsiaTheme="majorEastAsia" w:hAnsi="Arial Black" w:cstheme="majorBidi"/>
+          <w:color w:val="0F4761" w:themeColor="accent1" w:themeShade="BF"/>
+          <w:sz w:val="40"/>
+          <w:szCs w:val="40"/>
+        </w:rPr>
+      </w:pPr>
+      <w:bookmarkStart w:id="3" w:name="_Toc227925562"/>
+      <w:r>
+        <w:br w:type="page"/>
+      </w:r>
+    </w:p>
+    <w:p>
+      <w:pPr>
         <w:pStyle w:val="Titre1"/>
       </w:pPr>
-      <w:bookmarkStart w:id="3" w:name="_Toc227925562"/>
-      <w:r>
+      <w:r>
+        <w:lastRenderedPageBreak/>
         <w:t>Analyse des besoins</w:t>
       </w:r>
       <w:bookmarkEnd w:id="3"/>
@@ -3197,9 +3215,1204 @@
     </w:p>
     <w:p>
       <w:pPr>
+        <w:rPr>
+          <w:b/>
+          <w:bCs/>
+        </w:rPr>
+      </w:pPr>
+      <w:r>
+        <w:rPr>
+          <w:b/>
+          <w:bCs/>
+        </w:rPr>
+        <w:t xml:space="preserve">EF-01 </w:t>
+      </w:r>
+      <w:r>
+        <w:rPr>
+          <w:b/>
+          <w:bCs/>
+        </w:rPr>
+        <w:t>Reconnaissance des numéros de série (OCR)</w:t>
+      </w:r>
+    </w:p>
+    <w:tbl>
+      <w:tblPr>
+        <w:tblStyle w:val="Grilledutableau"/>
+        <w:tblW w:w="0" w:type="auto"/>
+        <w:tblLook w:val="04A0" w:firstRow="1" w:lastRow="0" w:firstColumn="1" w:lastColumn="0" w:noHBand="0" w:noVBand="1"/>
+      </w:tblPr>
+      <w:tblGrid>
+        <w:gridCol w:w="846"/>
+        <w:gridCol w:w="7087"/>
+        <w:gridCol w:w="1129"/>
+      </w:tblGrid>
+      <w:tr>
+        <w:tc>
+          <w:tcPr>
+            <w:tcW w:w="846" w:type="dxa"/>
+          </w:tcPr>
+          <w:p>
+            <w:pPr>
+              <w:jc w:val="center"/>
+            </w:pPr>
+            <w:r>
+              <w:t>Réf</w:t>
+            </w:r>
+          </w:p>
+        </w:tc>
+        <w:tc>
+          <w:tcPr>
+            <w:tcW w:w="7087" w:type="dxa"/>
+          </w:tcPr>
+          <w:p>
+            <w:pPr>
+              <w:jc w:val="center"/>
+            </w:pPr>
+            <w:r>
+              <w:t>Description</w:t>
+            </w:r>
+          </w:p>
+        </w:tc>
+        <w:tc>
+          <w:tcPr>
+            <w:tcW w:w="1129" w:type="dxa"/>
+          </w:tcPr>
+          <w:p>
+            <w:pPr>
+              <w:jc w:val="center"/>
+            </w:pPr>
+            <w:r>
+              <w:t>Priorité</w:t>
+            </w:r>
+          </w:p>
+        </w:tc>
+      </w:tr>
+      <w:tr>
+        <w:tc>
+          <w:tcPr>
+            <w:tcW w:w="846" w:type="dxa"/>
+          </w:tcPr>
+          <w:p>
+            <w:pPr>
+              <w:jc w:val="center"/>
+            </w:pPr>
+            <w:r>
+              <w:t>EF-01.1</w:t>
+            </w:r>
+          </w:p>
+        </w:tc>
+        <w:tc>
+          <w:tcPr>
+            <w:tcW w:w="7087" w:type="dxa"/>
+          </w:tcPr>
+          <w:p>
+            <w:r>
+              <w:t>L'application doit permettre l'</w:t>
+            </w:r>
+            <w:proofErr w:type="spellStart"/>
+            <w:r>
+              <w:t>upload</w:t>
+            </w:r>
+            <w:proofErr w:type="spellEnd"/>
+            <w:r>
+              <w:t xml:space="preserve"> d'une image contenant un numéro de série.</w:t>
+            </w:r>
+          </w:p>
+        </w:tc>
+        <w:tc>
+          <w:tcPr>
+            <w:tcW w:w="1129" w:type="dxa"/>
+          </w:tcPr>
+          <w:p>
+            <w:pPr>
+              <w:jc w:val="center"/>
+            </w:pPr>
+            <w:r>
+              <w:t>H</w:t>
+            </w:r>
+          </w:p>
+        </w:tc>
+      </w:tr>
+      <w:tr>
+        <w:tc>
+          <w:tcPr>
+            <w:tcW w:w="846" w:type="dxa"/>
+          </w:tcPr>
+          <w:p>
+            <w:pPr>
+              <w:jc w:val="center"/>
+            </w:pPr>
+            <w:r>
+              <w:t>EF-01.2</w:t>
+            </w:r>
+          </w:p>
+        </w:tc>
+        <w:tc>
+          <w:tcPr>
+            <w:tcW w:w="7087" w:type="dxa"/>
+          </w:tcPr>
+          <w:p>
+            <w:r>
+              <w:t>L'application doit extraire le texte de l'image via une technologie OCR.</w:t>
+            </w:r>
+          </w:p>
+        </w:tc>
+        <w:tc>
+          <w:tcPr>
+            <w:tcW w:w="1129" w:type="dxa"/>
+          </w:tcPr>
+          <w:p>
+            <w:pPr>
+              <w:jc w:val="center"/>
+            </w:pPr>
+            <w:r>
+              <w:t>H</w:t>
+            </w:r>
+          </w:p>
+        </w:tc>
+      </w:tr>
+      <w:tr>
+        <w:tc>
+          <w:tcPr>
+            <w:tcW w:w="846" w:type="dxa"/>
+          </w:tcPr>
+          <w:p>
+            <w:pPr>
+              <w:jc w:val="center"/>
+            </w:pPr>
+            <w:r>
+              <w:t>EF-01.3</w:t>
+            </w:r>
+          </w:p>
+        </w:tc>
+        <w:tc>
+          <w:tcPr>
+            <w:tcW w:w="7087" w:type="dxa"/>
+          </w:tcPr>
+          <w:p>
+            <w:r>
+              <w:t>L'application doit détecter automatiquement le numéro de série dans le texte extrait.</w:t>
+            </w:r>
+          </w:p>
+        </w:tc>
+        <w:tc>
+          <w:tcPr>
+            <w:tcW w:w="1129" w:type="dxa"/>
+          </w:tcPr>
+          <w:p>
+            <w:pPr>
+              <w:jc w:val="center"/>
+            </w:pPr>
+            <w:r>
+              <w:t>H</w:t>
+            </w:r>
+          </w:p>
+        </w:tc>
+      </w:tr>
+      <w:tr>
+        <w:tc>
+          <w:tcPr>
+            <w:tcW w:w="846" w:type="dxa"/>
+          </w:tcPr>
+          <w:p>
+            <w:pPr>
+              <w:jc w:val="center"/>
+            </w:pPr>
+            <w:r>
+              <w:t>EF-01.4</w:t>
+            </w:r>
+          </w:p>
+        </w:tc>
+        <w:tc>
+          <w:tcPr>
+            <w:tcW w:w="7087" w:type="dxa"/>
+          </w:tcPr>
+          <w:p>
+            <w:r>
+              <w:t>L'application doit afficher le résultat de la détection pour validation par l'utilisateur.</w:t>
+            </w:r>
+          </w:p>
+        </w:tc>
+        <w:tc>
+          <w:tcPr>
+            <w:tcW w:w="1129" w:type="dxa"/>
+          </w:tcPr>
+          <w:p>
+            <w:pPr>
+              <w:jc w:val="center"/>
+            </w:pPr>
+            <w:r>
+              <w:t>H</w:t>
+            </w:r>
+          </w:p>
+        </w:tc>
+      </w:tr>
+      <w:tr>
+        <w:tc>
+          <w:tcPr>
+            <w:tcW w:w="846" w:type="dxa"/>
+          </w:tcPr>
+          <w:p>
+            <w:pPr>
+              <w:jc w:val="center"/>
+            </w:pPr>
+            <w:r>
+              <w:t>EF-01.5</w:t>
+            </w:r>
+          </w:p>
+        </w:tc>
+        <w:tc>
+          <w:tcPr>
+            <w:tcW w:w="7087" w:type="dxa"/>
+          </w:tcPr>
+          <w:p>
+            <w:r>
+              <w:t>L'application doit permettre la correction manuelle du numéro en cas d'erreur OCR.</w:t>
+            </w:r>
+          </w:p>
+        </w:tc>
+        <w:tc>
+          <w:tcPr>
+            <w:tcW w:w="1129" w:type="dxa"/>
+          </w:tcPr>
+          <w:p>
+            <w:pPr>
+              <w:jc w:val="center"/>
+            </w:pPr>
+            <w:r>
+              <w:t>H</w:t>
+            </w:r>
+          </w:p>
+        </w:tc>
+      </w:tr>
+      <w:tr>
+        <w:tc>
+          <w:tcPr>
+            <w:tcW w:w="846" w:type="dxa"/>
+          </w:tcPr>
+          <w:p>
+            <w:pPr>
+              <w:jc w:val="center"/>
+            </w:pPr>
+            <w:r>
+              <w:t>EF-01.6</w:t>
+            </w:r>
+          </w:p>
+        </w:tc>
+        <w:tc>
+          <w:tcPr>
+            <w:tcW w:w="7087" w:type="dxa"/>
+          </w:tcPr>
+          <w:p>
+            <w:r>
+              <w:t>L'application doit enregistrer le numéro validé dans la base de données.</w:t>
+            </w:r>
+          </w:p>
+        </w:tc>
+        <w:tc>
+          <w:tcPr>
+            <w:tcW w:w="1129" w:type="dxa"/>
+          </w:tcPr>
+          <w:p>
+            <w:pPr>
+              <w:jc w:val="center"/>
+            </w:pPr>
+            <w:r>
+              <w:t>H</w:t>
+            </w:r>
+          </w:p>
+        </w:tc>
+      </w:tr>
+      <w:tr>
+        <w:tc>
+          <w:tcPr>
+            <w:tcW w:w="846" w:type="dxa"/>
+          </w:tcPr>
+          <w:p>
+            <w:pPr>
+              <w:jc w:val="center"/>
+            </w:pPr>
+            <w:r>
+              <w:t>EF-01.7</w:t>
+            </w:r>
+          </w:p>
+        </w:tc>
+        <w:tc>
+          <w:tcPr>
+            <w:tcW w:w="7087" w:type="dxa"/>
+          </w:tcPr>
+          <w:p>
+            <w:pPr>
+              <w:tabs>
+                <w:tab w:val="left" w:pos="2842"/>
+              </w:tabs>
+            </w:pPr>
+            <w:r>
+              <w:t>L'application doit gérer les erreurs liées à un texte bruité ou à une reconnaissance incorrecte.</w:t>
+            </w:r>
+            <w:r>
+              <w:tab/>
+            </w:r>
+          </w:p>
+        </w:tc>
+        <w:tc>
+          <w:tcPr>
+            <w:tcW w:w="1129" w:type="dxa"/>
+          </w:tcPr>
+          <w:p>
+            <w:pPr>
+              <w:jc w:val="center"/>
+            </w:pPr>
+            <w:r>
+              <w:t>H</w:t>
+            </w:r>
+          </w:p>
+        </w:tc>
+      </w:tr>
+      <w:tr>
+        <w:tc>
+          <w:tcPr>
+            <w:tcW w:w="846" w:type="dxa"/>
+          </w:tcPr>
+          <w:p>
+            <w:pPr>
+              <w:jc w:val="center"/>
+            </w:pPr>
+            <w:r>
+              <w:t>EF-</w:t>
+            </w:r>
+          </w:p>
+          <w:p>
+            <w:pPr>
+              <w:jc w:val="center"/>
+            </w:pPr>
+            <w:r>
+              <w:t>01.8</w:t>
+            </w:r>
+          </w:p>
+        </w:tc>
+        <w:tc>
+          <w:tcPr>
+            <w:tcW w:w="7087" w:type="dxa"/>
+          </w:tcPr>
+          <w:p>
+            <w:r>
+              <w:t>L'application doit détecter les doublons de numéros de série lors de l'enregistrement.</w:t>
+            </w:r>
+          </w:p>
+        </w:tc>
+        <w:tc>
+          <w:tcPr>
+            <w:tcW w:w="1129" w:type="dxa"/>
+          </w:tcPr>
+          <w:p>
+            <w:pPr>
+              <w:jc w:val="center"/>
+            </w:pPr>
+            <w:r>
+              <w:t>H</w:t>
+            </w:r>
+          </w:p>
+        </w:tc>
+      </w:tr>
+    </w:tbl>
+    <w:p>
+      <w:pPr>
+        <w:rPr>
+          <w:b/>
+          <w:bCs/>
+        </w:rPr>
+      </w:pPr>
+    </w:p>
+    <w:p>
+      <w:pPr>
+        <w:rPr>
+          <w:b/>
+          <w:bCs/>
+        </w:rPr>
+      </w:pPr>
+      <w:r>
+        <w:rPr>
+          <w:b/>
+          <w:bCs/>
+        </w:rPr>
+        <w:t>EF-02</w:t>
+      </w:r>
+      <w:r>
+        <w:rPr>
+          <w:b/>
+          <w:bCs/>
+        </w:rPr>
+        <w:t xml:space="preserve"> </w:t>
+      </w:r>
+      <w:r>
+        <w:rPr>
+          <w:b/>
+          <w:bCs/>
+        </w:rPr>
+        <w:t>Gestion des équipements</w:t>
+      </w:r>
+    </w:p>
+    <w:tbl>
+      <w:tblPr>
+        <w:tblStyle w:val="Grilledutableau"/>
+        <w:tblW w:w="0" w:type="auto"/>
+        <w:tblLook w:val="04A0" w:firstRow="1" w:lastRow="0" w:firstColumn="1" w:lastColumn="0" w:noHBand="0" w:noVBand="1"/>
+      </w:tblPr>
+      <w:tblGrid>
+        <w:gridCol w:w="846"/>
+        <w:gridCol w:w="7087"/>
+        <w:gridCol w:w="1129"/>
+      </w:tblGrid>
+      <w:tr>
+        <w:tc>
+          <w:tcPr>
+            <w:tcW w:w="846" w:type="dxa"/>
+          </w:tcPr>
+          <w:p>
+            <w:pPr>
+              <w:jc w:val="center"/>
+            </w:pPr>
+            <w:r>
+              <w:t>Réf</w:t>
+            </w:r>
+          </w:p>
+        </w:tc>
+        <w:tc>
+          <w:tcPr>
+            <w:tcW w:w="7087" w:type="dxa"/>
+          </w:tcPr>
+          <w:p>
+            <w:pPr>
+              <w:jc w:val="center"/>
+            </w:pPr>
+            <w:r>
+              <w:t>Description</w:t>
+            </w:r>
+          </w:p>
+        </w:tc>
+        <w:tc>
+          <w:tcPr>
+            <w:tcW w:w="1129" w:type="dxa"/>
+          </w:tcPr>
+          <w:p>
+            <w:pPr>
+              <w:jc w:val="center"/>
+            </w:pPr>
+            <w:r>
+              <w:t>Priorité</w:t>
+            </w:r>
+          </w:p>
+        </w:tc>
+      </w:tr>
+      <w:tr>
+        <w:tc>
+          <w:tcPr>
+            <w:tcW w:w="846" w:type="dxa"/>
+          </w:tcPr>
+          <w:p>
+            <w:pPr>
+              <w:jc w:val="center"/>
+            </w:pPr>
+            <w:r>
+              <w:t>EF-02.1</w:t>
+            </w:r>
+          </w:p>
+        </w:tc>
+        <w:tc>
+          <w:tcPr>
+            <w:tcW w:w="7087" w:type="dxa"/>
+          </w:tcPr>
+          <w:p>
+            <w:r>
+              <w:t>L'application doit permettre l'ajout manuel d'un équipement.</w:t>
+            </w:r>
+          </w:p>
+        </w:tc>
+        <w:tc>
+          <w:tcPr>
+            <w:tcW w:w="1129" w:type="dxa"/>
+          </w:tcPr>
+          <w:p>
+            <w:pPr>
+              <w:jc w:val="center"/>
+            </w:pPr>
+            <w:r>
+              <w:t>H</w:t>
+            </w:r>
+          </w:p>
+        </w:tc>
+      </w:tr>
+      <w:tr>
+        <w:tc>
+          <w:tcPr>
+            <w:tcW w:w="846" w:type="dxa"/>
+          </w:tcPr>
+          <w:p>
+            <w:pPr>
+              <w:jc w:val="center"/>
+            </w:pPr>
+            <w:r>
+              <w:t>EF-02.2</w:t>
+            </w:r>
+          </w:p>
+        </w:tc>
+        <w:tc>
+          <w:tcPr>
+            <w:tcW w:w="7087" w:type="dxa"/>
+          </w:tcPr>
+          <w:p>
+            <w:r>
+              <w:t>L'application doit permettre la modification d'un équipement existant.</w:t>
+            </w:r>
+          </w:p>
+        </w:tc>
+        <w:tc>
+          <w:tcPr>
+            <w:tcW w:w="1129" w:type="dxa"/>
+          </w:tcPr>
+          <w:p>
+            <w:pPr>
+              <w:jc w:val="center"/>
+            </w:pPr>
+            <w:r>
+              <w:t>H</w:t>
+            </w:r>
+          </w:p>
+        </w:tc>
+      </w:tr>
+      <w:tr>
+        <w:tc>
+          <w:tcPr>
+            <w:tcW w:w="846" w:type="dxa"/>
+          </w:tcPr>
+          <w:p>
+            <w:pPr>
+              <w:jc w:val="center"/>
+            </w:pPr>
+            <w:r>
+              <w:t>EF-02.3</w:t>
+            </w:r>
+          </w:p>
+        </w:tc>
+        <w:tc>
+          <w:tcPr>
+            <w:tcW w:w="7087" w:type="dxa"/>
+          </w:tcPr>
+          <w:p>
+            <w:r>
+              <w:t>L'application doit permettre la suppression d'un équipement.</w:t>
+            </w:r>
+          </w:p>
+        </w:tc>
+        <w:tc>
+          <w:tcPr>
+            <w:tcW w:w="1129" w:type="dxa"/>
+          </w:tcPr>
+          <w:p>
+            <w:pPr>
+              <w:jc w:val="center"/>
+            </w:pPr>
+            <w:r>
+              <w:t>H</w:t>
+            </w:r>
+          </w:p>
+        </w:tc>
+      </w:tr>
+      <w:tr>
+        <w:tc>
+          <w:tcPr>
+            <w:tcW w:w="846" w:type="dxa"/>
+          </w:tcPr>
+          <w:p>
+            <w:pPr>
+              <w:jc w:val="center"/>
+            </w:pPr>
+            <w:r>
+              <w:t>EF-02.4</w:t>
+            </w:r>
+          </w:p>
+        </w:tc>
+        <w:tc>
+          <w:tcPr>
+            <w:tcW w:w="7087" w:type="dxa"/>
+          </w:tcPr>
+          <w:p>
+            <w:r>
+              <w:t>L'application doit permettre la recherche d'équipements par numéro de série.</w:t>
+            </w:r>
+          </w:p>
+        </w:tc>
+        <w:tc>
+          <w:tcPr>
+            <w:tcW w:w="1129" w:type="dxa"/>
+          </w:tcPr>
+          <w:p>
+            <w:pPr>
+              <w:jc w:val="center"/>
+            </w:pPr>
+            <w:r>
+              <w:t>H</w:t>
+            </w:r>
+          </w:p>
+        </w:tc>
+      </w:tr>
+      <w:tr>
+        <w:tc>
+          <w:tcPr>
+            <w:tcW w:w="846" w:type="dxa"/>
+          </w:tcPr>
+          <w:p>
+            <w:pPr>
+              <w:jc w:val="center"/>
+            </w:pPr>
+            <w:r>
+              <w:t>EF-02.5</w:t>
+            </w:r>
+          </w:p>
+        </w:tc>
+        <w:tc>
+          <w:tcPr>
+            <w:tcW w:w="7087" w:type="dxa"/>
+          </w:tcPr>
+          <w:p>
+            <w:r>
+              <w:t>L'application doit permettre la recherche d'équipements par type.</w:t>
+            </w:r>
+          </w:p>
+        </w:tc>
+        <w:tc>
+          <w:tcPr>
+            <w:tcW w:w="1129" w:type="dxa"/>
+          </w:tcPr>
+          <w:p>
+            <w:pPr>
+              <w:jc w:val="center"/>
+            </w:pPr>
+            <w:r>
+              <w:t>H</w:t>
+            </w:r>
+          </w:p>
+        </w:tc>
+      </w:tr>
+      <w:tr>
+        <w:tc>
+          <w:tcPr>
+            <w:tcW w:w="846" w:type="dxa"/>
+          </w:tcPr>
+          <w:p>
+            <w:pPr>
+              <w:jc w:val="center"/>
+            </w:pPr>
+            <w:r>
+              <w:t>EF-02.6</w:t>
+            </w:r>
+          </w:p>
+        </w:tc>
+        <w:tc>
+          <w:tcPr>
+            <w:tcW w:w="7087" w:type="dxa"/>
+          </w:tcPr>
+          <w:p>
+            <w:r>
+              <w:t>Chaque équipement doit contenir au minimum : nom, marque, modèle, numéro de série (unique), type (ex. laptop, desktop, serveur) et statut (actif, en stock, en réparation, retiré).</w:t>
+            </w:r>
+          </w:p>
+        </w:tc>
+        <w:tc>
+          <w:tcPr>
+            <w:tcW w:w="1129" w:type="dxa"/>
+          </w:tcPr>
+          <w:p>
+            <w:pPr>
+              <w:jc w:val="center"/>
+            </w:pPr>
+            <w:r>
+              <w:t>H</w:t>
+            </w:r>
+          </w:p>
+        </w:tc>
+      </w:tr>
+      <w:tr>
+        <w:tc>
+          <w:tcPr>
+            <w:tcW w:w="846" w:type="dxa"/>
+          </w:tcPr>
+          <w:p>
+            <w:pPr>
+              <w:jc w:val="center"/>
+            </w:pPr>
+            <w:r>
+              <w:t>EF-01.7</w:t>
+            </w:r>
+          </w:p>
+        </w:tc>
+        <w:tc>
+          <w:tcPr>
+            <w:tcW w:w="7087" w:type="dxa"/>
+          </w:tcPr>
+          <w:p>
+            <w:pPr>
+              <w:tabs>
+                <w:tab w:val="left" w:pos="2842"/>
+              </w:tabs>
+            </w:pPr>
+            <w:r>
+              <w:t>L'application doit gérer les erreurs liées à un texte bruité ou à une reconnaissance incorrecte.</w:t>
+            </w:r>
+            <w:r>
+              <w:tab/>
+            </w:r>
+          </w:p>
+        </w:tc>
+        <w:tc>
+          <w:tcPr>
+            <w:tcW w:w="1129" w:type="dxa"/>
+          </w:tcPr>
+          <w:p>
+            <w:pPr>
+              <w:jc w:val="center"/>
+            </w:pPr>
+            <w:r>
+              <w:t>H</w:t>
+            </w:r>
+          </w:p>
+        </w:tc>
+      </w:tr>
+      <w:tr>
+        <w:tc>
+          <w:tcPr>
+            <w:tcW w:w="846" w:type="dxa"/>
+          </w:tcPr>
+          <w:p>
+            <w:pPr>
+              <w:jc w:val="center"/>
+            </w:pPr>
+            <w:r>
+              <w:t>EF-02.7</w:t>
+            </w:r>
+          </w:p>
+        </w:tc>
+        <w:tc>
+          <w:tcPr>
+            <w:tcW w:w="7087" w:type="dxa"/>
+          </w:tcPr>
+          <w:p>
+            <w:r>
+              <w:t>L'application doit permettre l'assignation d'un équipement à un utilisateur.</w:t>
+            </w:r>
+          </w:p>
+        </w:tc>
+        <w:tc>
+          <w:tcPr>
+            <w:tcW w:w="1129" w:type="dxa"/>
+          </w:tcPr>
+          <w:p>
+            <w:pPr>
+              <w:jc w:val="center"/>
+            </w:pPr>
+            <w:r>
+              <w:t>H</w:t>
+            </w:r>
+          </w:p>
+        </w:tc>
+      </w:tr>
+    </w:tbl>
+    <w:p>
+      <w:pPr>
+        <w:rPr>
+          <w:b/>
+          <w:bCs/>
+        </w:rPr>
+      </w:pPr>
+    </w:p>
+    <w:p>
+      <w:pPr>
+        <w:rPr>
+          <w:b/>
+          <w:bCs/>
+        </w:rPr>
+      </w:pPr>
+      <w:bookmarkStart w:id="5" w:name="_Toc227925564"/>
+      <w:r>
+        <w:rPr>
+          <w:b/>
+          <w:bCs/>
+        </w:rPr>
+        <w:lastRenderedPageBreak/>
+        <w:t>EF-03 Gestion de la garantie</w:t>
+      </w:r>
+    </w:p>
+    <w:tbl>
+      <w:tblPr>
+        <w:tblStyle w:val="Grilledutableau"/>
+        <w:tblW w:w="0" w:type="auto"/>
+        <w:tblLook w:val="04A0" w:firstRow="1" w:lastRow="0" w:firstColumn="1" w:lastColumn="0" w:noHBand="0" w:noVBand="1"/>
+      </w:tblPr>
+      <w:tblGrid>
+        <w:gridCol w:w="846"/>
+        <w:gridCol w:w="7087"/>
+        <w:gridCol w:w="1129"/>
+      </w:tblGrid>
+      <w:tr>
+        <w:tc>
+          <w:tcPr>
+            <w:tcW w:w="846" w:type="dxa"/>
+          </w:tcPr>
+          <w:p>
+            <w:pPr>
+              <w:jc w:val="center"/>
+            </w:pPr>
+            <w:r>
+              <w:t>Réf</w:t>
+            </w:r>
+          </w:p>
+        </w:tc>
+        <w:tc>
+          <w:tcPr>
+            <w:tcW w:w="7087" w:type="dxa"/>
+          </w:tcPr>
+          <w:p>
+            <w:pPr>
+              <w:jc w:val="center"/>
+            </w:pPr>
+            <w:r>
+              <w:t>Description</w:t>
+            </w:r>
+          </w:p>
+        </w:tc>
+        <w:tc>
+          <w:tcPr>
+            <w:tcW w:w="1129" w:type="dxa"/>
+          </w:tcPr>
+          <w:p>
+            <w:pPr>
+              <w:jc w:val="center"/>
+            </w:pPr>
+            <w:r>
+              <w:t>Priorité</w:t>
+            </w:r>
+          </w:p>
+        </w:tc>
+      </w:tr>
+      <w:tr>
+        <w:tc>
+          <w:tcPr>
+            <w:tcW w:w="846" w:type="dxa"/>
+          </w:tcPr>
+          <w:p>
+            <w:pPr>
+              <w:jc w:val="center"/>
+            </w:pPr>
+            <w:r>
+              <w:t>EF-02.1</w:t>
+            </w:r>
+          </w:p>
+        </w:tc>
+        <w:tc>
+          <w:tcPr>
+            <w:tcW w:w="7087" w:type="dxa"/>
+          </w:tcPr>
+          <w:p>
+            <w:r>
+              <w:t>L'application doit permettre l'ajout manuel d'un équipement.</w:t>
+            </w:r>
+          </w:p>
+        </w:tc>
+        <w:tc>
+          <w:tcPr>
+            <w:tcW w:w="1129" w:type="dxa"/>
+          </w:tcPr>
+          <w:p>
+            <w:pPr>
+              <w:jc w:val="center"/>
+            </w:pPr>
+            <w:r>
+              <w:t>H</w:t>
+            </w:r>
+          </w:p>
+        </w:tc>
+      </w:tr>
+      <w:tr>
+        <w:tc>
+          <w:tcPr>
+            <w:tcW w:w="846" w:type="dxa"/>
+          </w:tcPr>
+          <w:p>
+            <w:pPr>
+              <w:jc w:val="center"/>
+            </w:pPr>
+            <w:r>
+              <w:t>EF-02.2</w:t>
+            </w:r>
+          </w:p>
+        </w:tc>
+        <w:tc>
+          <w:tcPr>
+            <w:tcW w:w="7087" w:type="dxa"/>
+          </w:tcPr>
+          <w:p>
+            <w:r>
+              <w:t>L'application doit permettre la modification d'un équipement existant.</w:t>
+            </w:r>
+          </w:p>
+        </w:tc>
+        <w:tc>
+          <w:tcPr>
+            <w:tcW w:w="1129" w:type="dxa"/>
+          </w:tcPr>
+          <w:p>
+            <w:pPr>
+              <w:jc w:val="center"/>
+            </w:pPr>
+            <w:r>
+              <w:t>H</w:t>
+            </w:r>
+          </w:p>
+        </w:tc>
+      </w:tr>
+      <w:tr>
+        <w:tc>
+          <w:tcPr>
+            <w:tcW w:w="846" w:type="dxa"/>
+          </w:tcPr>
+          <w:p>
+            <w:pPr>
+              <w:jc w:val="center"/>
+            </w:pPr>
+            <w:r>
+              <w:t>EF-02.3</w:t>
+            </w:r>
+          </w:p>
+        </w:tc>
+        <w:tc>
+          <w:tcPr>
+            <w:tcW w:w="7087" w:type="dxa"/>
+          </w:tcPr>
+          <w:p>
+            <w:r>
+              <w:t>L'application doit permettre la suppression d'un équipement.</w:t>
+            </w:r>
+          </w:p>
+        </w:tc>
+        <w:tc>
+          <w:tcPr>
+            <w:tcW w:w="1129" w:type="dxa"/>
+          </w:tcPr>
+          <w:p>
+            <w:pPr>
+              <w:jc w:val="center"/>
+            </w:pPr>
+            <w:r>
+              <w:t>H</w:t>
+            </w:r>
+          </w:p>
+        </w:tc>
+      </w:tr>
+      <w:tr>
+        <w:tc>
+          <w:tcPr>
+            <w:tcW w:w="846" w:type="dxa"/>
+          </w:tcPr>
+          <w:p>
+            <w:pPr>
+              <w:jc w:val="center"/>
+            </w:pPr>
+            <w:r>
+              <w:t>EF-02.4</w:t>
+            </w:r>
+          </w:p>
+        </w:tc>
+        <w:tc>
+          <w:tcPr>
+            <w:tcW w:w="7087" w:type="dxa"/>
+          </w:tcPr>
+          <w:p>
+            <w:r>
+              <w:t>L'application doit permettre la recherche d'équipements par numéro de série.</w:t>
+            </w:r>
+          </w:p>
+        </w:tc>
+        <w:tc>
+          <w:tcPr>
+            <w:tcW w:w="1129" w:type="dxa"/>
+          </w:tcPr>
+          <w:p>
+            <w:pPr>
+              <w:jc w:val="center"/>
+            </w:pPr>
+            <w:r>
+              <w:t>H</w:t>
+            </w:r>
+          </w:p>
+        </w:tc>
+      </w:tr>
+      <w:tr>
+        <w:tc>
+          <w:tcPr>
+            <w:tcW w:w="846" w:type="dxa"/>
+          </w:tcPr>
+          <w:p>
+            <w:pPr>
+              <w:jc w:val="center"/>
+            </w:pPr>
+            <w:r>
+              <w:t>EF-02.5</w:t>
+            </w:r>
+          </w:p>
+        </w:tc>
+        <w:tc>
+          <w:tcPr>
+            <w:tcW w:w="7087" w:type="dxa"/>
+          </w:tcPr>
+          <w:p>
+            <w:r>
+              <w:t>L'application doit permettre la recherche d'équipements par type.</w:t>
+            </w:r>
+          </w:p>
+        </w:tc>
+        <w:tc>
+          <w:tcPr>
+            <w:tcW w:w="1129" w:type="dxa"/>
+          </w:tcPr>
+          <w:p>
+            <w:pPr>
+              <w:jc w:val="center"/>
+            </w:pPr>
+            <w:r>
+              <w:t>H</w:t>
+            </w:r>
+          </w:p>
+        </w:tc>
+      </w:tr>
+      <w:tr>
+        <w:tc>
+          <w:tcPr>
+            <w:tcW w:w="846" w:type="dxa"/>
+          </w:tcPr>
+          <w:p>
+            <w:pPr>
+              <w:jc w:val="center"/>
+            </w:pPr>
+            <w:r>
+              <w:t>EF-02.6</w:t>
+            </w:r>
+          </w:p>
+        </w:tc>
+        <w:tc>
+          <w:tcPr>
+            <w:tcW w:w="7087" w:type="dxa"/>
+          </w:tcPr>
+          <w:p>
+            <w:r>
+              <w:t>Chaque équipement doit contenir au minimum : nom, marque, modèle, numéro de série (unique), type (ex. laptop, desktop, serveur) et statut (actif, en stock, en réparation, retiré).</w:t>
+            </w:r>
+          </w:p>
+        </w:tc>
+        <w:tc>
+          <w:tcPr>
+            <w:tcW w:w="1129" w:type="dxa"/>
+          </w:tcPr>
+          <w:p>
+            <w:pPr>
+              <w:jc w:val="center"/>
+            </w:pPr>
+            <w:r>
+              <w:t>H</w:t>
+            </w:r>
+          </w:p>
+        </w:tc>
+      </w:tr>
+      <w:tr>
+        <w:tc>
+          <w:tcPr>
+            <w:tcW w:w="846" w:type="dxa"/>
+          </w:tcPr>
+          <w:p>
+            <w:pPr>
+              <w:jc w:val="center"/>
+            </w:pPr>
+            <w:r>
+              <w:t>EF-01.7</w:t>
+            </w:r>
+          </w:p>
+        </w:tc>
+        <w:tc>
+          <w:tcPr>
+            <w:tcW w:w="7087" w:type="dxa"/>
+          </w:tcPr>
+          <w:p>
+            <w:pPr>
+              <w:tabs>
+                <w:tab w:val="left" w:pos="2842"/>
+              </w:tabs>
+            </w:pPr>
+            <w:r>
+              <w:t>L'application doit gérer les erreurs liées à un texte bruité ou à une reconnaissance incorrecte.</w:t>
+            </w:r>
+            <w:r>
+              <w:tab/>
+            </w:r>
+          </w:p>
+        </w:tc>
+        <w:tc>
+          <w:tcPr>
+            <w:tcW w:w="1129" w:type="dxa"/>
+          </w:tcPr>
+          <w:p>
+            <w:pPr>
+              <w:jc w:val="center"/>
+            </w:pPr>
+            <w:r>
+              <w:t>H</w:t>
+            </w:r>
+          </w:p>
+        </w:tc>
+      </w:tr>
+      <w:tr>
+        <w:tc>
+          <w:tcPr>
+            <w:tcW w:w="846" w:type="dxa"/>
+          </w:tcPr>
+          <w:p>
+            <w:pPr>
+              <w:jc w:val="center"/>
+            </w:pPr>
+            <w:r>
+              <w:t>EF-02.7</w:t>
+            </w:r>
+          </w:p>
+        </w:tc>
+        <w:tc>
+          <w:tcPr>
+            <w:tcW w:w="7087" w:type="dxa"/>
+          </w:tcPr>
+          <w:p>
+            <w:r>
+              <w:t>L'application doit permettre l'assignation d'un équipement à un utilisateur.</w:t>
+            </w:r>
+          </w:p>
+        </w:tc>
+        <w:tc>
+          <w:tcPr>
+            <w:tcW w:w="1129" w:type="dxa"/>
+          </w:tcPr>
+          <w:p>
+            <w:pPr>
+              <w:jc w:val="center"/>
+            </w:pPr>
+            <w:r>
+              <w:t>H</w:t>
+            </w:r>
+          </w:p>
+        </w:tc>
+      </w:tr>
+    </w:tbl>
+    <w:p/>
+    <w:p>
+      <w:pPr>
         <w:pStyle w:val="Titre2"/>
       </w:pPr>
-      <w:bookmarkStart w:id="5" w:name="_Toc227925564"/>
       <w:r>
         <w:lastRenderedPageBreak/>
         <w:t>Exigences non fonctionnelles</w:t>
@@ -3756,6 +4969,118 @@
 <file path=word/numbering.xml><?xml version="1.0" encoding="utf-8"?>
 <w:numbering xmlns:wpc="http://schemas.microsoft.com/office/word/2010/wordprocessingCanvas" xmlns:cx="http://schemas.microsoft.com/office/drawing/2014/chartex" xmlns:cx1="http://schemas.microsoft.com/office/drawing/2015/9/8/chartex" xmlns:cx2="http://schemas.microsoft.com/office/drawing/2015/10/21/chartex" xmlns:cx3="http://schemas.microsoft.com/office/drawing/2016/5/9/chartex" xmlns:cx4="http://schemas.microsoft.com/office/drawing/2016/5/10/chartex" xmlns:cx5="http://schemas.microsoft.com/office/drawing/2016/5/11/chartex" xmlns:cx6="http://schemas.microsoft.com/office/drawing/2016/5/12/chartex" xmlns:cx7="http://schemas.microsoft.com/office/drawing/2016/5/13/chartex" xmlns:cx8="http://schemas.microsoft.com/office/drawing/2016/5/14/chartex" xmlns:mc="http://schemas.openxmlformats.org/markup-compatibility/2006" xmlns:aink="http://schemas.microsoft.com/office/drawing/2016/ink" xmlns:am3d="http://schemas.microsoft.com/office/drawing/2017/model3d" xmlns:o="urn:schemas-microsoft-com:office:office" xmlns:oel="http://schemas.microsoft.com/office/2019/extlst" xmlns:r="http://schemas.openxmlformats.org/officeDocument/2006/relationships" xmlns:m="http://schemas.openxmlformats.org/officeDocument/2006/math" xmlns:v="urn:schemas-microsoft-com:vml" xmlns:wp14="http://schemas.microsoft.com/office/word/2010/wordprocessingDrawing" xmlns:wp="http://schemas.openxmlformats.org/drawingml/2006/wordprocessingDrawing" xmlns:w10="urn:schemas-microsoft-com:office:word" xmlns:w="http://schemas.openxmlformats.org/wordprocessingml/2006/main" xmlns:w14="http://schemas.microsoft.com/office/word/2010/wordml" xmlns:w15="http://schemas.microsoft.com/office/word/2012/wordml" xmlns:w16cex="http://schemas.microsoft.com/office/word/2018/wordml/cex" xmlns:w16cid="http://schemas.microsoft.com/office/word/2016/wordml/cid" xmlns:w16="http://schemas.microsoft.com/office/word/2018/wordml" xmlns:w16du="http://schemas.microsoft.com/office/word/2023/wordml/word16du" xmlns:w16sdtdh="http://schemas.microsoft.com/office/word/2020/wordml/sdtdatahash" xmlns:w16sdtfl="http://schemas.microsoft.com/office/word/2024/wordml/sdtformatlock" xmlns:w16se="http://schemas.microsoft.com/office/word/2015/wordml/symex" xmlns:wpg="http://schemas.microsoft.com/office/word/2010/wordprocessingGroup" xmlns:wpi="http://schemas.microsoft.com/office/word/2010/wordprocessingInk" xmlns:wne="http://schemas.microsoft.com/office/word/2006/wordml" xmlns:wps="http://schemas.microsoft.com/office/word/2010/wordprocessingShape" mc:Ignorable="w14 w15 w16se w16cid w16 w16cex w16sdtdh w16sdtfl w16du wp14">
   <w:abstractNum w:abstractNumId="0" w15:restartNumberingAfterBreak="0">
+    <w:nsid w:val="68B52943"/>
+    <w:multiLevelType w:val="hybridMultilevel"/>
+    <w:tmpl w:val="2D5EFD5A"/>
+    <w:lvl w:ilvl="0" w:tplc="8D6E4038">
+      <w:numFmt w:val="bullet"/>
+      <w:lvlText w:val="-"/>
+      <w:lvlJc w:val="left"/>
+      <w:pPr>
+        <w:ind w:left="720" w:hanging="360"/>
+      </w:pPr>
+      <w:rPr>
+        <w:rFonts w:ascii="Arial" w:eastAsiaTheme="minorHAnsi" w:hAnsi="Arial" w:cs="Arial" w:hint="default"/>
+      </w:rPr>
+    </w:lvl>
+    <w:lvl w:ilvl="1" w:tplc="100C0003" w:tentative="1">
+      <w:start w:val="1"/>
+      <w:numFmt w:val="bullet"/>
+      <w:lvlText w:val="o"/>
+      <w:lvlJc w:val="left"/>
+      <w:pPr>
+        <w:ind w:left="1440" w:hanging="360"/>
+      </w:pPr>
+      <w:rPr>
+        <w:rFonts w:ascii="Courier New" w:hAnsi="Courier New" w:cs="Courier New" w:hint="default"/>
+      </w:rPr>
+    </w:lvl>
+    <w:lvl w:ilvl="2" w:tplc="100C0005" w:tentative="1">
+      <w:start w:val="1"/>
+      <w:numFmt w:val="bullet"/>
+      <w:lvlText w:val=""/>
+      <w:lvlJc w:val="left"/>
+      <w:pPr>
+        <w:ind w:left="2160" w:hanging="360"/>
+      </w:pPr>
+      <w:rPr>
+        <w:rFonts w:ascii="Wingdings" w:hAnsi="Wingdings" w:hint="default"/>
+      </w:rPr>
+    </w:lvl>
+    <w:lvl w:ilvl="3" w:tplc="100C0001" w:tentative="1">
+      <w:start w:val="1"/>
+      <w:numFmt w:val="bullet"/>
+      <w:lvlText w:val=""/>
+      <w:lvlJc w:val="left"/>
+      <w:pPr>
+        <w:ind w:left="2880" w:hanging="360"/>
+      </w:pPr>
+      <w:rPr>
+        <w:rFonts w:ascii="Symbol" w:hAnsi="Symbol" w:hint="default"/>
+      </w:rPr>
+    </w:lvl>
+    <w:lvl w:ilvl="4" w:tplc="100C0003" w:tentative="1">
+      <w:start w:val="1"/>
+      <w:numFmt w:val="bullet"/>
+      <w:lvlText w:val="o"/>
+      <w:lvlJc w:val="left"/>
+      <w:pPr>
+        <w:ind w:left="3600" w:hanging="360"/>
+      </w:pPr>
+      <w:rPr>
+        <w:rFonts w:ascii="Courier New" w:hAnsi="Courier New" w:cs="Courier New" w:hint="default"/>
+      </w:rPr>
+    </w:lvl>
+    <w:lvl w:ilvl="5" w:tplc="100C0005" w:tentative="1">
+      <w:start w:val="1"/>
+      <w:numFmt w:val="bullet"/>
+      <w:lvlText w:val=""/>
+      <w:lvlJc w:val="left"/>
+      <w:pPr>
+        <w:ind w:left="4320" w:hanging="360"/>
+      </w:pPr>
+      <w:rPr>
+        <w:rFonts w:ascii="Wingdings" w:hAnsi="Wingdings" w:hint="default"/>
+      </w:rPr>
+    </w:lvl>
+    <w:lvl w:ilvl="6" w:tplc="100C0001" w:tentative="1">
+      <w:start w:val="1"/>
+      <w:numFmt w:val="bullet"/>
+      <w:lvlText w:val=""/>
+      <w:lvlJc w:val="left"/>
+      <w:pPr>
+        <w:ind w:left="5040" w:hanging="360"/>
+      </w:pPr>
+      <w:rPr>
+        <w:rFonts w:ascii="Symbol" w:hAnsi="Symbol" w:hint="default"/>
+      </w:rPr>
+    </w:lvl>
+    <w:lvl w:ilvl="7" w:tplc="100C0003" w:tentative="1">
+      <w:start w:val="1"/>
+      <w:numFmt w:val="bullet"/>
+      <w:lvlText w:val="o"/>
+      <w:lvlJc w:val="left"/>
+      <w:pPr>
+        <w:ind w:left="5760" w:hanging="360"/>
+      </w:pPr>
+      <w:rPr>
+        <w:rFonts w:ascii="Courier New" w:hAnsi="Courier New" w:cs="Courier New" w:hint="default"/>
+      </w:rPr>
+    </w:lvl>
+    <w:lvl w:ilvl="8" w:tplc="100C0005" w:tentative="1">
+      <w:start w:val="1"/>
+      <w:numFmt w:val="bullet"/>
+      <w:lvlText w:val=""/>
+      <w:lvlJc w:val="left"/>
+      <w:pPr>
+        <w:ind w:left="6480" w:hanging="360"/>
+      </w:pPr>
+      <w:rPr>
+        <w:rFonts w:ascii="Wingdings" w:hAnsi="Wingdings" w:hint="default"/>
+      </w:rPr>
+    </w:lvl>
+  </w:abstractNum>
+  <w:abstractNum w:abstractNumId="1" w15:restartNumberingAfterBreak="0">
     <w:nsid w:val="7C4D7AB1"/>
     <w:multiLevelType w:val="hybridMultilevel"/>
     <w:tmpl w:val="56E2ABE4"/>
@@ -3869,6 +5194,9 @@
     </w:lvl>
   </w:abstractNum>
   <w:num w:numId="1" w16cid:durableId="1217355618">
+    <w:abstractNumId w:val="1"/>
+  </w:num>
+  <w:num w:numId="2" w16cid:durableId="1987278527">
     <w:abstractNumId w:val="0"/>
   </w:num>
 </w:numbering>
@@ -4274,7 +5602,7 @@
   <w:style w:type="paragraph" w:default="1" w:styleId="Normal">
     <w:name w:val="Normal"/>
     <w:qFormat/>
-    <w:rsid w:val="00F0199E"/>
+    <w:rsid w:val="000E3C0E"/>
     <w:rPr>
       <w:rFonts w:ascii="Arial" w:hAnsi="Arial" w:cs="Arial"/>
     </w:rPr>
@@ -4480,7 +5808,6 @@
   <w:style w:type="character" w:default="1" w:styleId="Policepardfaut">
     <w:name w:val="Default Paragraph Font"/>
     <w:uiPriority w:val="1"/>
-    <w:semiHidden/>
     <w:unhideWhenUsed/>
   </w:style>
   <w:style w:type="table" w:default="1" w:styleId="TableauNormal">
@@ -4899,6 +6226,25 @@
       <w:rFonts w:ascii="Arial" w:hAnsi="Arial" w:cs="Arial"/>
     </w:rPr>
   </w:style>
+  <w:style w:type="table" w:styleId="Grilledutableau">
+    <w:name w:val="Table Grid"/>
+    <w:basedOn w:val="TableauNormal"/>
+    <w:uiPriority w:val="39"/>
+    <w:rsid w:val="00FE4724"/>
+    <w:pPr>
+      <w:spacing w:after="0" w:line="240" w:lineRule="auto"/>
+    </w:pPr>
+    <w:tblPr>
+      <w:tblBorders>
+        <w:top w:val="single" w:sz="4" w:space="0" w:color="auto"/>
+        <w:left w:val="single" w:sz="4" w:space="0" w:color="auto"/>
+        <w:bottom w:val="single" w:sz="4" w:space="0" w:color="auto"/>
+        <w:right w:val="single" w:sz="4" w:space="0" w:color="auto"/>
+        <w:insideH w:val="single" w:sz="4" w:space="0" w:color="auto"/>
+        <w:insideV w:val="single" w:sz="4" w:space="0" w:color="auto"/>
+      </w:tblBorders>
+    </w:tblPr>
+  </w:style>
 </w:styles>
 </file>
 

</xml_diff>